<commit_message>
Finalize beginner-ready Metabo-Diet release
</commit_message>
<xml_diff>
--- a/module/support/metabo_diet_instructor_packet.docx
+++ b/module/support/metabo_diet_instructor_packet.docx
@@ -438,7 +438,7 @@
           <w:rFonts w:ascii="Calibri" w:hAnsi="Calibri"/>
           <w:color w:val="222222"/>
         </w:rPr>
-        <w:t>This module teaches learners to determine what can and cannot be compared across a diet-anchored and an exercise-anchored metabolomics study. Success is not measured by maximizing integration. A defensible decision to keep a field, feature, matrix, timepoint, or quantitative table separate is a successful outcome.</w:t>
+        <w:t>This module teaches learners to decide what the two studies can support. Keeping an incompatible field, feature, matrix, timepoint, or quantitative table separate is an acceptable result.</w:t>
       </w:r>
     </w:p>
     <w:p>
@@ -456,7 +456,7 @@
           <w:b/>
           <w:color w:val="1F4D78"/>
         </w:rPr>
-        <w:t>Non-negotiable scientific guardrail:</w:t>
+        <w:t>Scope:</w:t>
       </w:r>
       <w:r>
         <w:rPr>
@@ -525,7 +525,7 @@
           <w:rFonts w:ascii="Calibri" w:hAnsi="Calibri"/>
           <w:color w:val="222222"/>
         </w:rPr>
-        <w:t>Use basic Python and pandas operations.</w:t>
+        <w:t>Read guided Python and pandas cells and change the named values when prompted.</w:t>
       </w:r>
     </w:p>
     <w:p>
@@ -583,6 +583,15 @@
           <w:color w:val="222222"/>
         </w:rPr>
         <w:t>No prior Metabolomics Workbench, RefMet, MoTrPAC, NPH, or All of Us experience is required.</w:t>
+      </w:r>
+    </w:p>
+    <w:p>
+      <w:r>
+        <w:rPr>
+          <w:rFonts w:ascii="Calibri" w:hAnsi="Calibri"/>
+          <w:color w:val="222222"/>
+        </w:rPr>
+        <w:t>No prior terminal or Jupyter experience is required for the guided path, but learners need basic familiarity with tables and scatterplots. The module is not a general Python course. Direct first-time setup appears before the pretest; R is optional.</w:t>
       </w:r>
     </w:p>
     <w:p>
@@ -1062,7 +1071,7 @@
                 <w:color w:val="222222"/>
                 <w:sz w:val="16"/>
               </w:rPr>
-              <w:t>Lessons 1-4; interpretation guardrails; bounded-claim exercise</w:t>
+              <w:t>Lessons 1-4; interpretation limits; bounded-claim exercise</w:t>
             </w:r>
           </w:p>
         </w:tc>
@@ -2131,7 +2140,7 @@
           <w:rFonts w:ascii="Calibri" w:hAnsi="Calibri"/>
           <w:color w:val="222222"/>
         </w:rPr>
-        <w:t>The 140 minutes include embedded knowledge checks but exclude the 5-minute pretest and 8-minute posttest, for an expected learner total of about 153 minutes. If learners are new to pandas or metabolomics, schedule an optional 30-minute orientation rather than compressing the guardrail discussions.</w:t>
+        <w:t>The 140 minutes include embedded knowledge checks but exclude the 5-minute pretest, 8-minute posttest, and software installation, for an expected course total of about 153 minutes after setup. If learners are new to Python, Jupyter, PCA, or metabolomics, schedule 30 to 60 additional minutes and use the reduced worksheet path stated in each lesson.</w:t>
       </w:r>
     </w:p>
     <w:p>
@@ -2787,6 +2796,22 @@
           <w:color w:val="222222"/>
         </w:rPr>
         <w:t>[ ] Run the notebook from a fresh environment with live retrieval.</w:t>
+      </w:r>
+    </w:p>
+    <w:p>
+      <w:pPr>
+        <w:numPr>
+          <w:ilvl w:val="0"/>
+          <w:numId w:val="15"/>
+        </w:numPr>
+        <w:spacing w:after="80" w:line="300" w:lineRule="auto"/>
+      </w:pPr>
+      <w:r>
+        <w:rPr>
+          <w:rFonts w:ascii="Calibri" w:hAnsi="Calibri"/>
+          <w:color w:val="222222"/>
+        </w:rPr>
+        <w:t>[ ] Confirm the first-time setup works before opening the pretest and that the smoke-test command writes a separate notebook.</w:t>
       </w:r>
     </w:p>
     <w:p>
@@ -4671,7 +4696,7 @@
                 <w:color w:val="222222"/>
                 <w:sz w:val="18"/>
               </w:rPr>
-              <w:t>Learner lacks Python environment</w:t>
+              <w:t>Learner lacks a working Python environment</w:t>
             </w:r>
           </w:p>
         </w:tc>
@@ -4698,7 +4723,7 @@
                 <w:color w:val="222222"/>
                 <w:sz w:val="18"/>
               </w:rPr>
-              <w:t>Use the supported hosted notebook or instructor-run demonstration; do not skip the decision-log activity.</w:t>
+              <w:t>Use the first-time setup guide and default cache. An instructor demonstration may preview the output, but schedule the learner's hands-on run after setup rather than treating the demonstration as completion.</w:t>
             </w:r>
           </w:p>
         </w:tc>
@@ -8049,10 +8074,10 @@
         <w:tblInd w:w="120" w:type="dxa"/>
       </w:tblPr>
       <w:tblGrid>
-        <w:gridCol w:w="1655"/>
-        <w:gridCol w:w="1704"/>
-        <w:gridCol w:w="4142"/>
-        <w:gridCol w:w="1859"/>
+        <w:gridCol w:w="1642"/>
+        <w:gridCol w:w="1693"/>
+        <w:gridCol w:w="1986"/>
+        <w:gridCol w:w="4039"/>
       </w:tblGrid>
       <w:tr>
         <w:trPr>
@@ -8061,7 +8086,7 @@
         </w:trPr>
         <w:tc>
           <w:tcPr>
-            <w:tcW w:type="dxa" w:w="1655"/>
+            <w:tcW w:type="dxa" w:w="1642"/>
             <w:tcMar>
               <w:top w:w="80" w:type="dxa"/>
               <w:bottom w:w="80" w:type="dxa"/>
@@ -8095,7 +8120,7 @@
         </w:tc>
         <w:tc>
           <w:tcPr>
-            <w:tcW w:type="dxa" w:w="1704"/>
+            <w:tcW w:type="dxa" w:w="1693"/>
             <w:tcMar>
               <w:top w:w="80" w:type="dxa"/>
               <w:bottom w:w="80" w:type="dxa"/>
@@ -8129,7 +8154,7 @@
         </w:tc>
         <w:tc>
           <w:tcPr>
-            <w:tcW w:type="dxa" w:w="4142"/>
+            <w:tcW w:type="dxa" w:w="1986"/>
             <w:tcMar>
               <w:top w:w="80" w:type="dxa"/>
               <w:bottom w:w="80" w:type="dxa"/>
@@ -8163,7 +8188,7 @@
         </w:tc>
         <w:tc>
           <w:tcPr>
-            <w:tcW w:type="dxa" w:w="1859"/>
+            <w:tcW w:type="dxa" w:w="4039"/>
             <w:tcMar>
               <w:top w:w="80" w:type="dxa"/>
               <w:bottom w:w="80" w:type="dxa"/>
@@ -8202,7 +8227,7 @@
         </w:trPr>
         <w:tc>
           <w:tcPr>
-            <w:tcW w:type="dxa" w:w="1655"/>
+            <w:tcW w:type="dxa" w:w="1642"/>
             <w:tcMar>
               <w:top w:w="80" w:type="dxa"/>
               <w:bottom w:w="80" w:type="dxa"/>
@@ -8229,7 +8254,7 @@
         </w:tc>
         <w:tc>
           <w:tcPr>
-            <w:tcW w:type="dxa" w:w="1704"/>
+            <w:tcW w:type="dxa" w:w="1693"/>
             <w:tcMar>
               <w:top w:w="80" w:type="dxa"/>
               <w:bottom w:w="80" w:type="dxa"/>
@@ -8256,7 +8281,34 @@
         </w:tc>
         <w:tc>
           <w:tcPr>
-            <w:tcW w:type="dxa" w:w="4142"/>
+            <w:tcW w:type="dxa" w:w="1986"/>
+            <w:tcMar>
+              <w:top w:w="80" w:type="dxa"/>
+              <w:bottom w:w="80" w:type="dxa"/>
+              <w:start w:w="120" w:type="dxa"/>
+              <w:end w:w="120" w:type="dxa"/>
+            </w:tcMar>
+            <w:vAlign w:val="center"/>
+          </w:tcPr>
+          <w:p>
+            <w:pPr>
+              <w:spacing w:before="0" w:after="0" w:line="269" w:lineRule="auto"/>
+              <w:jc w:val="center"/>
+            </w:pPr>
+            <w:r/>
+            <w:r>
+              <w:rPr>
+                <w:rFonts w:ascii="Calibri" w:hAnsi="Calibri"/>
+                <w:color w:val="222222"/>
+                <w:sz w:val="16"/>
+              </w:rPr>
+              <w:t>LO1</w:t>
+            </w:r>
+          </w:p>
+        </w:tc>
+        <w:tc>
+          <w:tcPr>
+            <w:tcW w:type="dxa" w:w="4039"/>
             <w:tcMar>
               <w:top w:w="80" w:type="dxa"/>
               <w:bottom w:w="80" w:type="dxa"/>
@@ -8313,25 +8365,6 @@
               </w:rPr>
               <w:t xml:space="preserve"> QC rows.</w:t>
             </w:r>
-          </w:p>
-        </w:tc>
-        <w:tc>
-          <w:tcPr>
-            <w:tcW w:type="dxa" w:w="1859"/>
-            <w:tcMar>
-              <w:top w:w="80" w:type="dxa"/>
-              <w:bottom w:w="80" w:type="dxa"/>
-              <w:start w:w="120" w:type="dxa"/>
-              <w:end w:w="120" w:type="dxa"/>
-            </w:tcMar>
-            <w:vAlign w:val="center"/>
-          </w:tcPr>
-          <w:p>
-            <w:pPr>
-              <w:spacing w:before="0" w:after="0" w:line="269" w:lineRule="auto"/>
-              <w:jc w:val="center"/>
-            </w:pPr>
-            <w:r/>
           </w:p>
         </w:tc>
       </w:tr>
@@ -8341,7 +8374,7 @@
         </w:trPr>
         <w:tc>
           <w:tcPr>
-            <w:tcW w:type="dxa" w:w="1655"/>
+            <w:tcW w:type="dxa" w:w="1642"/>
             <w:tcMar>
               <w:top w:w="80" w:type="dxa"/>
               <w:bottom w:w="80" w:type="dxa"/>
@@ -8368,7 +8401,7 @@
         </w:tc>
         <w:tc>
           <w:tcPr>
-            <w:tcW w:type="dxa" w:w="1704"/>
+            <w:tcW w:type="dxa" w:w="1693"/>
             <w:tcMar>
               <w:top w:w="80" w:type="dxa"/>
               <w:bottom w:w="80" w:type="dxa"/>
@@ -8395,7 +8428,34 @@
         </w:tc>
         <w:tc>
           <w:tcPr>
-            <w:tcW w:type="dxa" w:w="4142"/>
+            <w:tcW w:type="dxa" w:w="1986"/>
+            <w:tcMar>
+              <w:top w:w="80" w:type="dxa"/>
+              <w:bottom w:w="80" w:type="dxa"/>
+              <w:start w:w="120" w:type="dxa"/>
+              <w:end w:w="120" w:type="dxa"/>
+            </w:tcMar>
+            <w:vAlign w:val="center"/>
+          </w:tcPr>
+          <w:p>
+            <w:pPr>
+              <w:spacing w:before="0" w:after="0" w:line="269" w:lineRule="auto"/>
+              <w:jc w:val="center"/>
+            </w:pPr>
+            <w:r/>
+            <w:r>
+              <w:rPr>
+                <w:rFonts w:ascii="Calibri" w:hAnsi="Calibri"/>
+                <w:color w:val="222222"/>
+                <w:sz w:val="16"/>
+              </w:rPr>
+              <w:t>LO1, LO2</w:t>
+            </w:r>
+          </w:p>
+        </w:tc>
+        <w:tc>
+          <w:tcPr>
+            <w:tcW w:type="dxa" w:w="4039"/>
             <w:tcMar>
               <w:top w:w="80" w:type="dxa"/>
               <w:bottom w:w="80" w:type="dxa"/>
@@ -8418,25 +8478,6 @@
               </w:rPr>
               <w:t>Preserve plasma and serum and limit the broad blood-derived category to discovery.</w:t>
             </w:r>
-          </w:p>
-        </w:tc>
-        <w:tc>
-          <w:tcPr>
-            <w:tcW w:type="dxa" w:w="1859"/>
-            <w:tcMar>
-              <w:top w:w="80" w:type="dxa"/>
-              <w:bottom w:w="80" w:type="dxa"/>
-              <w:start w:w="120" w:type="dxa"/>
-              <w:end w:w="120" w:type="dxa"/>
-            </w:tcMar>
-            <w:vAlign w:val="center"/>
-          </w:tcPr>
-          <w:p>
-            <w:pPr>
-              <w:spacing w:before="0" w:after="0" w:line="269" w:lineRule="auto"/>
-              <w:jc w:val="center"/>
-            </w:pPr>
-            <w:r/>
           </w:p>
         </w:tc>
       </w:tr>
@@ -8446,7 +8487,7 @@
         </w:trPr>
         <w:tc>
           <w:tcPr>
-            <w:tcW w:type="dxa" w:w="1655"/>
+            <w:tcW w:type="dxa" w:w="1642"/>
             <w:tcMar>
               <w:top w:w="80" w:type="dxa"/>
               <w:bottom w:w="80" w:type="dxa"/>
@@ -8473,7 +8514,7 @@
         </w:tc>
         <w:tc>
           <w:tcPr>
-            <w:tcW w:type="dxa" w:w="1704"/>
+            <w:tcW w:type="dxa" w:w="1693"/>
             <w:tcMar>
               <w:top w:w="80" w:type="dxa"/>
               <w:bottom w:w="80" w:type="dxa"/>
@@ -8500,7 +8541,34 @@
         </w:tc>
         <w:tc>
           <w:tcPr>
-            <w:tcW w:type="dxa" w:w="4142"/>
+            <w:tcW w:type="dxa" w:w="1986"/>
+            <w:tcMar>
+              <w:top w:w="80" w:type="dxa"/>
+              <w:bottom w:w="80" w:type="dxa"/>
+              <w:start w:w="120" w:type="dxa"/>
+              <w:end w:w="120" w:type="dxa"/>
+            </w:tcMar>
+            <w:vAlign w:val="center"/>
+          </w:tcPr>
+          <w:p>
+            <w:pPr>
+              <w:spacing w:before="0" w:after="0" w:line="269" w:lineRule="auto"/>
+              <w:jc w:val="center"/>
+            </w:pPr>
+            <w:r/>
+            <w:r>
+              <w:rPr>
+                <w:rFonts w:ascii="Calibri" w:hAnsi="Calibri"/>
+                <w:color w:val="222222"/>
+                <w:sz w:val="16"/>
+              </w:rPr>
+              <w:t>LO1, LO2</w:t>
+            </w:r>
+          </w:p>
+        </w:tc>
+        <w:tc>
+          <w:tcPr>
+            <w:tcW w:type="dxa" w:w="4039"/>
             <w:tcMar>
               <w:top w:w="80" w:type="dxa"/>
               <w:bottom w:w="80" w:type="dxa"/>
@@ -8523,25 +8591,6 @@
               </w:rPr>
               <w:t>FARMM Day 9 and 3-hour post-exercise recovery have different anchors and protocol meaning.</w:t>
             </w:r>
-          </w:p>
-        </w:tc>
-        <w:tc>
-          <w:tcPr>
-            <w:tcW w:type="dxa" w:w="1859"/>
-            <w:tcMar>
-              <w:top w:w="80" w:type="dxa"/>
-              <w:bottom w:w="80" w:type="dxa"/>
-              <w:start w:w="120" w:type="dxa"/>
-              <w:end w:w="120" w:type="dxa"/>
-            </w:tcMar>
-            <w:vAlign w:val="center"/>
-          </w:tcPr>
-          <w:p>
-            <w:pPr>
-              <w:spacing w:before="0" w:after="0" w:line="269" w:lineRule="auto"/>
-              <w:jc w:val="center"/>
-            </w:pPr>
-            <w:r/>
           </w:p>
         </w:tc>
       </w:tr>
@@ -8551,7 +8600,7 @@
         </w:trPr>
         <w:tc>
           <w:tcPr>
-            <w:tcW w:type="dxa" w:w="1655"/>
+            <w:tcW w:type="dxa" w:w="1642"/>
             <w:tcMar>
               <w:top w:w="80" w:type="dxa"/>
               <w:bottom w:w="80" w:type="dxa"/>
@@ -8578,7 +8627,7 @@
         </w:tc>
         <w:tc>
           <w:tcPr>
-            <w:tcW w:type="dxa" w:w="1704"/>
+            <w:tcW w:type="dxa" w:w="1693"/>
             <w:tcMar>
               <w:top w:w="80" w:type="dxa"/>
               <w:bottom w:w="80" w:type="dxa"/>
@@ -8605,7 +8654,34 @@
         </w:tc>
         <w:tc>
           <w:tcPr>
-            <w:tcW w:type="dxa" w:w="4142"/>
+            <w:tcW w:type="dxa" w:w="1986"/>
+            <w:tcMar>
+              <w:top w:w="80" w:type="dxa"/>
+              <w:bottom w:w="80" w:type="dxa"/>
+              <w:start w:w="120" w:type="dxa"/>
+              <w:end w:w="120" w:type="dxa"/>
+            </w:tcMar>
+            <w:vAlign w:val="center"/>
+          </w:tcPr>
+          <w:p>
+            <w:pPr>
+              <w:spacing w:before="0" w:after="0" w:line="269" w:lineRule="auto"/>
+              <w:jc w:val="center"/>
+            </w:pPr>
+            <w:r/>
+            <w:r>
+              <w:rPr>
+                <w:rFonts w:ascii="Calibri" w:hAnsi="Calibri"/>
+                <w:color w:val="222222"/>
+                <w:sz w:val="16"/>
+              </w:rPr>
+              <w:t>LO2</w:t>
+            </w:r>
+          </w:p>
+        </w:tc>
+        <w:tc>
+          <w:tcPr>
+            <w:tcW w:type="dxa" w:w="4039"/>
             <w:tcMar>
               <w:top w:w="80" w:type="dxa"/>
               <w:bottom w:w="80" w:type="dxa"/>
@@ -8628,25 +8704,6 @@
               </w:rPr>
               <w:t>Study-specific population, matrix, lab, platform, time, and protocol differences confound a direct contrast.</w:t>
             </w:r>
-          </w:p>
-        </w:tc>
-        <w:tc>
-          <w:tcPr>
-            <w:tcW w:type="dxa" w:w="1859"/>
-            <w:tcMar>
-              <w:top w:w="80" w:type="dxa"/>
-              <w:bottom w:w="80" w:type="dxa"/>
-              <w:start w:w="120" w:type="dxa"/>
-              <w:end w:w="120" w:type="dxa"/>
-            </w:tcMar>
-            <w:vAlign w:val="center"/>
-          </w:tcPr>
-          <w:p>
-            <w:pPr>
-              <w:spacing w:before="0" w:after="0" w:line="269" w:lineRule="auto"/>
-              <w:jc w:val="center"/>
-            </w:pPr>
-            <w:r/>
           </w:p>
         </w:tc>
       </w:tr>
@@ -8656,7 +8713,7 @@
         </w:trPr>
         <w:tc>
           <w:tcPr>
-            <w:tcW w:type="dxa" w:w="1655"/>
+            <w:tcW w:type="dxa" w:w="1642"/>
             <w:tcMar>
               <w:top w:w="80" w:type="dxa"/>
               <w:bottom w:w="80" w:type="dxa"/>
@@ -8683,7 +8740,7 @@
         </w:tc>
         <w:tc>
           <w:tcPr>
-            <w:tcW w:type="dxa" w:w="1704"/>
+            <w:tcW w:type="dxa" w:w="1693"/>
             <w:tcMar>
               <w:top w:w="80" w:type="dxa"/>
               <w:bottom w:w="80" w:type="dxa"/>
@@ -8710,7 +8767,34 @@
         </w:tc>
         <w:tc>
           <w:tcPr>
-            <w:tcW w:type="dxa" w:w="4142"/>
+            <w:tcW w:type="dxa" w:w="1986"/>
+            <w:tcMar>
+              <w:top w:w="80" w:type="dxa"/>
+              <w:bottom w:w="80" w:type="dxa"/>
+              <w:start w:w="120" w:type="dxa"/>
+              <w:end w:w="120" w:type="dxa"/>
+            </w:tcMar>
+            <w:vAlign w:val="center"/>
+          </w:tcPr>
+          <w:p>
+            <w:pPr>
+              <w:spacing w:before="0" w:after="0" w:line="269" w:lineRule="auto"/>
+              <w:jc w:val="center"/>
+            </w:pPr>
+            <w:r/>
+            <w:r>
+              <w:rPr>
+                <w:rFonts w:ascii="Calibri" w:hAnsi="Calibri"/>
+                <w:color w:val="222222"/>
+                <w:sz w:val="16"/>
+              </w:rPr>
+              <w:t>LO3</w:t>
+            </w:r>
+          </w:p>
+        </w:tc>
+        <w:tc>
+          <w:tcPr>
+            <w:tcW w:type="dxa" w:w="4039"/>
             <w:tcMar>
               <w:top w:w="80" w:type="dxa"/>
               <w:bottom w:w="80" w:type="dxa"/>
@@ -8733,25 +8817,6 @@
               </w:rPr>
               <w:t>Isotope/internal-standard roles must be preserved and excluded from biological overlap.</w:t>
             </w:r>
-          </w:p>
-        </w:tc>
-        <w:tc>
-          <w:tcPr>
-            <w:tcW w:type="dxa" w:w="1859"/>
-            <w:tcMar>
-              <w:top w:w="80" w:type="dxa"/>
-              <w:bottom w:w="80" w:type="dxa"/>
-              <w:start w:w="120" w:type="dxa"/>
-              <w:end w:w="120" w:type="dxa"/>
-            </w:tcMar>
-            <w:vAlign w:val="center"/>
-          </w:tcPr>
-          <w:p>
-            <w:pPr>
-              <w:spacing w:before="0" w:after="0" w:line="269" w:lineRule="auto"/>
-              <w:jc w:val="center"/>
-            </w:pPr>
-            <w:r/>
           </w:p>
         </w:tc>
       </w:tr>
@@ -8761,7 +8826,7 @@
         </w:trPr>
         <w:tc>
           <w:tcPr>
-            <w:tcW w:type="dxa" w:w="1655"/>
+            <w:tcW w:type="dxa" w:w="1642"/>
             <w:tcMar>
               <w:top w:w="80" w:type="dxa"/>
               <w:bottom w:w="80" w:type="dxa"/>
@@ -8788,7 +8853,7 @@
         </w:tc>
         <w:tc>
           <w:tcPr>
-            <w:tcW w:type="dxa" w:w="1704"/>
+            <w:tcW w:type="dxa" w:w="1693"/>
             <w:tcMar>
               <w:top w:w="80" w:type="dxa"/>
               <w:bottom w:w="80" w:type="dxa"/>
@@ -8815,7 +8880,34 @@
         </w:tc>
         <w:tc>
           <w:tcPr>
-            <w:tcW w:type="dxa" w:w="4142"/>
+            <w:tcW w:type="dxa" w:w="1986"/>
+            <w:tcMar>
+              <w:top w:w="80" w:type="dxa"/>
+              <w:bottom w:w="80" w:type="dxa"/>
+              <w:start w:w="120" w:type="dxa"/>
+              <w:end w:w="120" w:type="dxa"/>
+            </w:tcMar>
+            <w:vAlign w:val="center"/>
+          </w:tcPr>
+          <w:p>
+            <w:pPr>
+              <w:spacing w:before="0" w:after="0" w:line="269" w:lineRule="auto"/>
+              <w:jc w:val="center"/>
+            </w:pPr>
+            <w:r/>
+            <w:r>
+              <w:rPr>
+                <w:rFonts w:ascii="Calibri" w:hAnsi="Calibri"/>
+                <w:color w:val="222222"/>
+                <w:sz w:val="16"/>
+              </w:rPr>
+              <w:t>LO3</w:t>
+            </w:r>
+          </w:p>
+        </w:tc>
+        <w:tc>
+          <w:tcPr>
+            <w:tcW w:type="dxa" w:w="4039"/>
             <w:tcMar>
               <w:top w:w="80" w:type="dxa"/>
               <w:bottom w:w="80" w:type="dxa"/>
@@ -8838,25 +8930,6 @@
               </w:rPr>
               <w:t>Preserve feature-level provenance; a set collapse is distinct from a quantitative feature merge.</w:t>
             </w:r>
-          </w:p>
-        </w:tc>
-        <w:tc>
-          <w:tcPr>
-            <w:tcW w:type="dxa" w:w="1859"/>
-            <w:tcMar>
-              <w:top w:w="80" w:type="dxa"/>
-              <w:bottom w:w="80" w:type="dxa"/>
-              <w:start w:w="120" w:type="dxa"/>
-              <w:end w:w="120" w:type="dxa"/>
-            </w:tcMar>
-            <w:vAlign w:val="center"/>
-          </w:tcPr>
-          <w:p>
-            <w:pPr>
-              <w:spacing w:before="0" w:after="0" w:line="269" w:lineRule="auto"/>
-              <w:jc w:val="center"/>
-            </w:pPr>
-            <w:r/>
           </w:p>
         </w:tc>
       </w:tr>
@@ -8866,7 +8939,7 @@
         </w:trPr>
         <w:tc>
           <w:tcPr>
-            <w:tcW w:type="dxa" w:w="1655"/>
+            <w:tcW w:type="dxa" w:w="1642"/>
             <w:tcMar>
               <w:top w:w="80" w:type="dxa"/>
               <w:bottom w:w="80" w:type="dxa"/>
@@ -8893,7 +8966,7 @@
         </w:tc>
         <w:tc>
           <w:tcPr>
-            <w:tcW w:type="dxa" w:w="1704"/>
+            <w:tcW w:type="dxa" w:w="1693"/>
             <w:tcMar>
               <w:top w:w="80" w:type="dxa"/>
               <w:bottom w:w="80" w:type="dxa"/>
@@ -8920,7 +8993,34 @@
         </w:tc>
         <w:tc>
           <w:tcPr>
-            <w:tcW w:type="dxa" w:w="4142"/>
+            <w:tcW w:type="dxa" w:w="1986"/>
+            <w:tcMar>
+              <w:top w:w="80" w:type="dxa"/>
+              <w:bottom w:w="80" w:type="dxa"/>
+              <w:start w:w="120" w:type="dxa"/>
+              <w:end w:w="120" w:type="dxa"/>
+            </w:tcMar>
+            <w:vAlign w:val="center"/>
+          </w:tcPr>
+          <w:p>
+            <w:pPr>
+              <w:spacing w:before="0" w:after="0" w:line="269" w:lineRule="auto"/>
+              <w:jc w:val="center"/>
+            </w:pPr>
+            <w:r/>
+            <w:r>
+              <w:rPr>
+                <w:rFonts w:ascii="Calibri" w:hAnsi="Calibri"/>
+                <w:color w:val="222222"/>
+                <w:sz w:val="16"/>
+              </w:rPr>
+              <w:t>LO3, LO4</w:t>
+            </w:r>
+          </w:p>
+        </w:tc>
+        <w:tc>
+          <w:tcPr>
+            <w:tcW w:type="dxa" w:w="4039"/>
             <w:tcMar>
               <w:top w:w="80" w:type="dxa"/>
               <w:bottom w:w="80" w:type="dxa"/>
@@ -8960,25 +9060,6 @@
               </w:rPr>
               <w:t xml:space="preserve"> exclusions.</w:t>
             </w:r>
-          </w:p>
-        </w:tc>
-        <w:tc>
-          <w:tcPr>
-            <w:tcW w:type="dxa" w:w="1859"/>
-            <w:tcMar>
-              <w:top w:w="80" w:type="dxa"/>
-              <w:bottom w:w="80" w:type="dxa"/>
-              <w:start w:w="120" w:type="dxa"/>
-              <w:end w:w="120" w:type="dxa"/>
-            </w:tcMar>
-            <w:vAlign w:val="center"/>
-          </w:tcPr>
-          <w:p>
-            <w:pPr>
-              <w:spacing w:before="0" w:after="0" w:line="269" w:lineRule="auto"/>
-              <w:jc w:val="center"/>
-            </w:pPr>
-            <w:r/>
           </w:p>
         </w:tc>
       </w:tr>
@@ -8988,7 +9069,7 @@
         </w:trPr>
         <w:tc>
           <w:tcPr>
-            <w:tcW w:type="dxa" w:w="1655"/>
+            <w:tcW w:type="dxa" w:w="1642"/>
             <w:tcMar>
               <w:top w:w="80" w:type="dxa"/>
               <w:bottom w:w="80" w:type="dxa"/>
@@ -9015,7 +9096,7 @@
         </w:tc>
         <w:tc>
           <w:tcPr>
-            <w:tcW w:type="dxa" w:w="1704"/>
+            <w:tcW w:type="dxa" w:w="1693"/>
             <w:tcMar>
               <w:top w:w="80" w:type="dxa"/>
               <w:bottom w:w="80" w:type="dxa"/>
@@ -9042,7 +9123,34 @@
         </w:tc>
         <w:tc>
           <w:tcPr>
-            <w:tcW w:type="dxa" w:w="4142"/>
+            <w:tcW w:type="dxa" w:w="1986"/>
+            <w:tcMar>
+              <w:top w:w="80" w:type="dxa"/>
+              <w:bottom w:w="80" w:type="dxa"/>
+              <w:start w:w="120" w:type="dxa"/>
+              <w:end w:w="120" w:type="dxa"/>
+            </w:tcMar>
+            <w:vAlign w:val="center"/>
+          </w:tcPr>
+          <w:p>
+            <w:pPr>
+              <w:spacing w:before="0" w:after="0" w:line="269" w:lineRule="auto"/>
+              <w:jc w:val="center"/>
+            </w:pPr>
+            <w:r/>
+            <w:r>
+              <w:rPr>
+                <w:rFonts w:ascii="Calibri" w:hAnsi="Calibri"/>
+                <w:color w:val="222222"/>
+                <w:sz w:val="16"/>
+              </w:rPr>
+              <w:t>LO2, LO4</w:t>
+            </w:r>
+          </w:p>
+        </w:tc>
+        <w:tc>
+          <w:tcPr>
+            <w:tcW w:type="dxa" w:w="4039"/>
             <w:tcMar>
               <w:top w:w="80" w:type="dxa"/>
               <w:bottom w:w="80" w:type="dxa"/>
@@ -9065,25 +9173,6 @@
               </w:rPr>
               <w:t>Quantitative exploration is fitted within study; the uncalibrated raw matrices are not stacked.</w:t>
             </w:r>
-          </w:p>
-        </w:tc>
-        <w:tc>
-          <w:tcPr>
-            <w:tcW w:type="dxa" w:w="1859"/>
-            <w:tcMar>
-              <w:top w:w="80" w:type="dxa"/>
-              <w:bottom w:w="80" w:type="dxa"/>
-              <w:start w:w="120" w:type="dxa"/>
-              <w:end w:w="120" w:type="dxa"/>
-            </w:tcMar>
-            <w:vAlign w:val="center"/>
-          </w:tcPr>
-          <w:p>
-            <w:pPr>
-              <w:spacing w:before="0" w:after="0" w:line="269" w:lineRule="auto"/>
-              <w:jc w:val="center"/>
-            </w:pPr>
-            <w:r/>
           </w:p>
         </w:tc>
       </w:tr>
@@ -9093,7 +9182,7 @@
         </w:trPr>
         <w:tc>
           <w:tcPr>
-            <w:tcW w:type="dxa" w:w="1655"/>
+            <w:tcW w:type="dxa" w:w="1642"/>
             <w:tcMar>
               <w:top w:w="80" w:type="dxa"/>
               <w:bottom w:w="80" w:type="dxa"/>
@@ -9120,7 +9209,7 @@
         </w:tc>
         <w:tc>
           <w:tcPr>
-            <w:tcW w:type="dxa" w:w="1704"/>
+            <w:tcW w:type="dxa" w:w="1693"/>
             <w:tcMar>
               <w:top w:w="80" w:type="dxa"/>
               <w:bottom w:w="80" w:type="dxa"/>
@@ -9147,7 +9236,34 @@
         </w:tc>
         <w:tc>
           <w:tcPr>
-            <w:tcW w:type="dxa" w:w="4142"/>
+            <w:tcW w:type="dxa" w:w="1986"/>
+            <w:tcMar>
+              <w:top w:w="80" w:type="dxa"/>
+              <w:bottom w:w="80" w:type="dxa"/>
+              <w:start w:w="120" w:type="dxa"/>
+              <w:end w:w="120" w:type="dxa"/>
+            </w:tcMar>
+            <w:vAlign w:val="center"/>
+          </w:tcPr>
+          <w:p>
+            <w:pPr>
+              <w:spacing w:before="0" w:after="0" w:line="269" w:lineRule="auto"/>
+              <w:jc w:val="center"/>
+            </w:pPr>
+            <w:r/>
+            <w:r>
+              <w:rPr>
+                <w:rFonts w:ascii="Calibri" w:hAnsi="Calibri"/>
+                <w:color w:val="222222"/>
+                <w:sz w:val="16"/>
+              </w:rPr>
+              <w:t>LO4</w:t>
+            </w:r>
+          </w:p>
+        </w:tc>
+        <w:tc>
+          <w:tcPr>
+            <w:tcW w:type="dxa" w:w="4039"/>
             <w:tcMar>
               <w:top w:w="80" w:type="dxa"/>
               <w:bottom w:w="80" w:type="dxa"/>
@@ -9170,25 +9286,6 @@
               </w:rPr>
               <w:t>Cache use requires failure evidence, timestamp, integrity verification, and a visible source flag.</w:t>
             </w:r>
-          </w:p>
-        </w:tc>
-        <w:tc>
-          <w:tcPr>
-            <w:tcW w:type="dxa" w:w="1859"/>
-            <w:tcMar>
-              <w:top w:w="80" w:type="dxa"/>
-              <w:bottom w:w="80" w:type="dxa"/>
-              <w:start w:w="120" w:type="dxa"/>
-              <w:end w:w="120" w:type="dxa"/>
-            </w:tcMar>
-            <w:vAlign w:val="center"/>
-          </w:tcPr>
-          <w:p>
-            <w:pPr>
-              <w:spacing w:before="0" w:after="0" w:line="269" w:lineRule="auto"/>
-              <w:jc w:val="center"/>
-            </w:pPr>
-            <w:r/>
           </w:p>
         </w:tc>
       </w:tr>
@@ -9198,7 +9295,7 @@
         </w:trPr>
         <w:tc>
           <w:tcPr>
-            <w:tcW w:type="dxa" w:w="1655"/>
+            <w:tcW w:type="dxa" w:w="1642"/>
             <w:tcMar>
               <w:top w:w="80" w:type="dxa"/>
               <w:bottom w:w="80" w:type="dxa"/>
@@ -9225,7 +9322,7 @@
         </w:tc>
         <w:tc>
           <w:tcPr>
-            <w:tcW w:type="dxa" w:w="1704"/>
+            <w:tcW w:type="dxa" w:w="1693"/>
             <w:tcMar>
               <w:top w:w="80" w:type="dxa"/>
               <w:bottom w:w="80" w:type="dxa"/>
@@ -9252,7 +9349,34 @@
         </w:tc>
         <w:tc>
           <w:tcPr>
-            <w:tcW w:type="dxa" w:w="4142"/>
+            <w:tcW w:type="dxa" w:w="1986"/>
+            <w:tcMar>
+              <w:top w:w="80" w:type="dxa"/>
+              <w:bottom w:w="80" w:type="dxa"/>
+              <w:start w:w="120" w:type="dxa"/>
+              <w:end w:w="120" w:type="dxa"/>
+            </w:tcMar>
+            <w:vAlign w:val="center"/>
+          </w:tcPr>
+          <w:p>
+            <w:pPr>
+              <w:spacing w:before="0" w:after="0" w:line="269" w:lineRule="auto"/>
+              <w:jc w:val="center"/>
+            </w:pPr>
+            <w:r/>
+            <w:r>
+              <w:rPr>
+                <w:rFonts w:ascii="Calibri" w:hAnsi="Calibri"/>
+                <w:color w:val="222222"/>
+                <w:sz w:val="16"/>
+              </w:rPr>
+              <w:t>LO5</w:t>
+            </w:r>
+          </w:p>
+        </w:tc>
+        <w:tc>
+          <w:tcPr>
+            <w:tcW w:type="dxa" w:w="4039"/>
             <w:tcMar>
               <w:top w:w="80" w:type="dxa"/>
               <w:bottom w:w="80" w:type="dxa"/>
@@ -9275,25 +9399,6 @@
               </w:rPr>
               <w:t>MoTrPAC access is dataset- and release-dependent and must be checked.</w:t>
             </w:r>
-          </w:p>
-        </w:tc>
-        <w:tc>
-          <w:tcPr>
-            <w:tcW w:type="dxa" w:w="1859"/>
-            <w:tcMar>
-              <w:top w:w="80" w:type="dxa"/>
-              <w:bottom w:w="80" w:type="dxa"/>
-              <w:start w:w="120" w:type="dxa"/>
-              <w:end w:w="120" w:type="dxa"/>
-            </w:tcMar>
-            <w:vAlign w:val="center"/>
-          </w:tcPr>
-          <w:p>
-            <w:pPr>
-              <w:spacing w:before="0" w:after="0" w:line="269" w:lineRule="auto"/>
-              <w:jc w:val="center"/>
-            </w:pPr>
-            <w:r/>
           </w:p>
         </w:tc>
       </w:tr>
@@ -9303,7 +9408,7 @@
         </w:trPr>
         <w:tc>
           <w:tcPr>
-            <w:tcW w:type="dxa" w:w="1655"/>
+            <w:tcW w:type="dxa" w:w="1642"/>
             <w:tcMar>
               <w:top w:w="80" w:type="dxa"/>
               <w:bottom w:w="80" w:type="dxa"/>
@@ -9330,7 +9435,7 @@
         </w:tc>
         <w:tc>
           <w:tcPr>
-            <w:tcW w:type="dxa" w:w="1704"/>
+            <w:tcW w:type="dxa" w:w="1693"/>
             <w:tcMar>
               <w:top w:w="80" w:type="dxa"/>
               <w:bottom w:w="80" w:type="dxa"/>
@@ -9357,7 +9462,34 @@
         </w:tc>
         <w:tc>
           <w:tcPr>
-            <w:tcW w:type="dxa" w:w="4142"/>
+            <w:tcW w:type="dxa" w:w="1986"/>
+            <w:tcMar>
+              <w:top w:w="80" w:type="dxa"/>
+              <w:bottom w:w="80" w:type="dxa"/>
+              <w:start w:w="120" w:type="dxa"/>
+              <w:end w:w="120" w:type="dxa"/>
+            </w:tcMar>
+            <w:vAlign w:val="center"/>
+          </w:tcPr>
+          <w:p>
+            <w:pPr>
+              <w:spacing w:before="0" w:after="0" w:line="269" w:lineRule="auto"/>
+              <w:jc w:val="center"/>
+            </w:pPr>
+            <w:r/>
+            <w:r>
+              <w:rPr>
+                <w:rFonts w:ascii="Calibri" w:hAnsi="Calibri"/>
+                <w:color w:val="222222"/>
+                <w:sz w:val="16"/>
+              </w:rPr>
+              <w:t>LO5</w:t>
+            </w:r>
+          </w:p>
+        </w:tc>
+        <w:tc>
+          <w:tcPr>
+            <w:tcW w:type="dxa" w:w="4039"/>
             <w:tcMar>
               <w:top w:w="80" w:type="dxa"/>
               <w:bottom w:w="80" w:type="dxa"/>
@@ -9380,25 +9512,6 @@
               </w:rPr>
               <w:t>NPH participant-level analysis belongs in the Researcher Workbench and output follows current policy.</w:t>
             </w:r>
-          </w:p>
-        </w:tc>
-        <w:tc>
-          <w:tcPr>
-            <w:tcW w:type="dxa" w:w="1859"/>
-            <w:tcMar>
-              <w:top w:w="80" w:type="dxa"/>
-              <w:bottom w:w="80" w:type="dxa"/>
-              <w:start w:w="120" w:type="dxa"/>
-              <w:end w:w="120" w:type="dxa"/>
-            </w:tcMar>
-            <w:vAlign w:val="center"/>
-          </w:tcPr>
-          <w:p>
-            <w:pPr>
-              <w:spacing w:before="0" w:after="0" w:line="269" w:lineRule="auto"/>
-              <w:jc w:val="center"/>
-            </w:pPr>
-            <w:r/>
           </w:p>
         </w:tc>
       </w:tr>
@@ -9408,7 +9521,7 @@
         </w:trPr>
         <w:tc>
           <w:tcPr>
-            <w:tcW w:type="dxa" w:w="1655"/>
+            <w:tcW w:type="dxa" w:w="1642"/>
             <w:tcMar>
               <w:top w:w="80" w:type="dxa"/>
               <w:bottom w:w="80" w:type="dxa"/>
@@ -9435,7 +9548,7 @@
         </w:tc>
         <w:tc>
           <w:tcPr>
-            <w:tcW w:type="dxa" w:w="1704"/>
+            <w:tcW w:type="dxa" w:w="1693"/>
             <w:tcMar>
               <w:top w:w="80" w:type="dxa"/>
               <w:bottom w:w="80" w:type="dxa"/>
@@ -9462,7 +9575,34 @@
         </w:tc>
         <w:tc>
           <w:tcPr>
-            <w:tcW w:type="dxa" w:w="4142"/>
+            <w:tcW w:type="dxa" w:w="1986"/>
+            <w:tcMar>
+              <w:top w:w="80" w:type="dxa"/>
+              <w:bottom w:w="80" w:type="dxa"/>
+              <w:start w:w="120" w:type="dxa"/>
+              <w:end w:w="120" w:type="dxa"/>
+            </w:tcMar>
+            <w:vAlign w:val="center"/>
+          </w:tcPr>
+          <w:p>
+            <w:pPr>
+              <w:spacing w:before="0" w:after="0" w:line="269" w:lineRule="auto"/>
+              <w:jc w:val="center"/>
+            </w:pPr>
+            <w:r/>
+            <w:r>
+              <w:rPr>
+                <w:rFonts w:ascii="Calibri" w:hAnsi="Calibri"/>
+                <w:color w:val="222222"/>
+                <w:sz w:val="16"/>
+              </w:rPr>
+              <w:t>LO3, LO4</w:t>
+            </w:r>
+          </w:p>
+        </w:tc>
+        <w:tc>
+          <w:tcPr>
+            <w:tcW w:type="dxa" w:w="4039"/>
             <w:tcMar>
               <w:top w:w="80" w:type="dxa"/>
               <w:bottom w:w="80" w:type="dxa"/>
@@ -9485,25 +9625,6 @@
               </w:rPr>
               <w:t>Unexpected row multiplication requires a join-cardinality audit before analysis.</w:t>
             </w:r>
-          </w:p>
-        </w:tc>
-        <w:tc>
-          <w:tcPr>
-            <w:tcW w:type="dxa" w:w="1859"/>
-            <w:tcMar>
-              <w:top w:w="80" w:type="dxa"/>
-              <w:bottom w:w="80" w:type="dxa"/>
-              <w:start w:w="120" w:type="dxa"/>
-              <w:end w:w="120" w:type="dxa"/>
-            </w:tcMar>
-            <w:vAlign w:val="center"/>
-          </w:tcPr>
-          <w:p>
-            <w:pPr>
-              <w:spacing w:before="0" w:after="0" w:line="269" w:lineRule="auto"/>
-              <w:jc w:val="center"/>
-            </w:pPr>
-            <w:r/>
           </w:p>
         </w:tc>
       </w:tr>
@@ -10246,7 +10367,7 @@
           <w:rFonts w:ascii="Calibri" w:hAnsi="Calibri"/>
           <w:color w:val="1F4D78"/>
         </w:rPr>
-        <w:t>We will not combine peak-area values across the studies because matrix, laboratory, chromatography, feature coverage, preprocessing, population, time, and intervention context differ. We can still compare reviewed RefMet-name coverage using provenance-preserving study-specific sets and explicit eligibility rules.</w:t>
+        <w:t>We will not combine peak-area values across the studies because matrix, laboratory, chromatography, feature coverage, preprocessing, population, time, and intervention context differ. We can still compare reviewed RefMet names by building one documented set for each study and reporting their overlap.</w:t>
       </w:r>
     </w:p>
     <w:p>
@@ -24663,7 +24784,7 @@
                 <w:color w:val="222222"/>
                 <w:sz w:val="18"/>
               </w:rPr>
-              <w:t>"Access is the only gate."</w:t>
+              <w:t>"Access is the only issue."</w:t>
             </w:r>
           </w:p>
         </w:tc>
@@ -24690,7 +24811,7 @@
                 <w:color w:val="222222"/>
                 <w:sz w:val="18"/>
               </w:rPr>
-              <w:t>Scientific design and measurement compatibility remain independent gates.</w:t>
+              <w:t>A dataset can be accessible and still be unsuitable for the intended scientific comparison.</w:t>
             </w:r>
           </w:p>
         </w:tc>
@@ -28337,8 +28458,19 @@
           <w:rFonts w:ascii="Calibri" w:hAnsi="Calibri"/>
           <w:color w:val="222222"/>
         </w:rPr>
-        <w:t>Project DOI: &lt;https://doi.org/10.21228/M8B984&gt;</w:t>
-      </w:r>
+        <w:t xml:space="preserve">Project DOI: </w:t>
+      </w:r>
+      <w:hyperlink r:id="rId30">
+        <w:r>
+          <w:rPr>
+            <w:rFonts w:ascii="Calibri" w:hAnsi="Calibri"/>
+            <w:color w:val="2E74B5"/>
+            <w:u w:val="single"/>
+            <w:sz w:val="22"/>
+          </w:rPr>
+          <w:t>10.21228/M8B984</w:t>
+        </w:r>
+      </w:hyperlink>
     </w:p>
     <w:p>
       <w:pPr>
@@ -28353,8 +28485,19 @@
           <w:rFonts w:ascii="Calibri" w:hAnsi="Calibri"/>
           <w:color w:val="222222"/>
         </w:rPr>
-        <w:t>Repository record: &lt;https://www.metabolomicsworkbench.org/data/DRCCMetadata.php?Mode=Study&amp;StudyID=ST001521&gt;</w:t>
-      </w:r>
+        <w:t xml:space="preserve">Repository record: </w:t>
+      </w:r>
+      <w:hyperlink r:id="rId31">
+        <w:r>
+          <w:rPr>
+            <w:rFonts w:ascii="Calibri" w:hAnsi="Calibri"/>
+            <w:color w:val="2E74B5"/>
+            <w:u w:val="single"/>
+            <w:sz w:val="22"/>
+          </w:rPr>
+          <w:t>Metabolomics Workbench ST001521</w:t>
+        </w:r>
+      </w:hyperlink>
     </w:p>
     <w:p>
       <w:pPr>
@@ -28371,7 +28514,7 @@
         </w:rPr>
         <w:t xml:space="preserve">License: </w:t>
       </w:r>
-      <w:hyperlink r:id="rId30">
+      <w:hyperlink r:id="rId32">
         <w:r>
           <w:rPr>
             <w:rFonts w:ascii="Calibri" w:hAnsi="Calibri"/>
@@ -28464,8 +28607,19 @@
           <w:rFonts w:ascii="Calibri" w:hAnsi="Calibri"/>
           <w:color w:val="222222"/>
         </w:rPr>
-        <w:t>Project DOI: &lt;https://doi.org/10.21228/M8C802&gt;</w:t>
-      </w:r>
+        <w:t xml:space="preserve">Project DOI: </w:t>
+      </w:r>
+      <w:hyperlink r:id="rId33">
+        <w:r>
+          <w:rPr>
+            <w:rFonts w:ascii="Calibri" w:hAnsi="Calibri"/>
+            <w:color w:val="2E74B5"/>
+            <w:u w:val="single"/>
+            <w:sz w:val="22"/>
+          </w:rPr>
+          <w:t>10.21228/M8C802</w:t>
+        </w:r>
+      </w:hyperlink>
     </w:p>
     <w:p>
       <w:pPr>
@@ -28480,8 +28634,19 @@
           <w:rFonts w:ascii="Calibri" w:hAnsi="Calibri"/>
           <w:color w:val="222222"/>
         </w:rPr>
-        <w:t>Repository record: &lt;https://www.metabolomicsworkbench.org/data/DRCCMetadata.php?Mode=Study&amp;StudyID=ST003348&gt;</w:t>
-      </w:r>
+        <w:t xml:space="preserve">Repository record: </w:t>
+      </w:r>
+      <w:hyperlink r:id="rId34">
+        <w:r>
+          <w:rPr>
+            <w:rFonts w:ascii="Calibri" w:hAnsi="Calibri"/>
+            <w:color w:val="2E74B5"/>
+            <w:u w:val="single"/>
+            <w:sz w:val="22"/>
+          </w:rPr>
+          <w:t>Metabolomics Workbench ST003348</w:t>
+        </w:r>
+      </w:hyperlink>
     </w:p>
     <w:p>
       <w:pPr>
@@ -28498,7 +28663,7 @@
         </w:rPr>
         <w:t xml:space="preserve">License: </w:t>
       </w:r>
-      <w:hyperlink r:id="rId30">
+      <w:hyperlink r:id="rId32">
         <w:r>
           <w:rPr>
             <w:rFonts w:ascii="Calibri" w:hAnsi="Calibri"/>
@@ -28557,8 +28722,19 @@
           <w:rFonts w:ascii="Calibri" w:hAnsi="Calibri"/>
           <w:color w:val="222222"/>
         </w:rPr>
-        <w:t>Endpoint: &lt;https://www.metabolomicsworkbench.org/rest/refmet/classification&gt;</w:t>
-      </w:r>
+        <w:t xml:space="preserve">Endpoint: </w:t>
+      </w:r>
+      <w:hyperlink r:id="rId35">
+        <w:r>
+          <w:rPr>
+            <w:rFonts w:ascii="Calibri" w:hAnsi="Calibri"/>
+            <w:color w:val="2E74B5"/>
+            <w:u w:val="single"/>
+            <w:sz w:val="22"/>
+          </w:rPr>
+          <w:t>RefMet classification REST endpoint</w:t>
+        </w:r>
+      </w:hyperlink>
     </w:p>
     <w:p>
       <w:pPr>
@@ -28573,18 +28749,9 @@
           <w:rFonts w:ascii="Calibri" w:hAnsi="Calibri"/>
           <w:color w:val="222222"/>
         </w:rPr>
-        <w:t>Documentation: &lt;https://www.metabolomicsworkbench.org/tools/mw_rest.php&gt;</w:t>
-      </w:r>
-    </w:p>
-    <w:p>
-      <w:r>
-        <w:rPr>
-          <w:rFonts w:ascii="Calibri" w:hAnsi="Calibri"/>
-          <w:color w:val="222222"/>
-        </w:rPr>
-        <w:t xml:space="preserve">Exact retrieval times, response sizes, SHA-256 checksums, release fields, and transformations are recorded in </w:t>
-      </w:r>
-      <w:hyperlink r:id="rId31">
+        <w:t xml:space="preserve">Documentation: </w:t>
+      </w:r>
+      <w:hyperlink r:id="rId11">
         <w:r>
           <w:rPr>
             <w:rFonts w:ascii="Calibri" w:hAnsi="Calibri"/>
@@ -28592,15 +28759,33 @@
             <w:u w:val="single"/>
             <w:sz w:val="22"/>
           </w:rPr>
-          <w:t>`data/provenance.json`</w:t>
+          <w:t>Metabolomics Workbench REST documentation</w:t>
         </w:r>
       </w:hyperlink>
+    </w:p>
+    <w:p>
       <w:r>
         <w:rPr>
           <w:rFonts w:ascii="Calibri" w:hAnsi="Calibri"/>
           <w:color w:val="222222"/>
         </w:rPr>
-        <w:t>.</w:t>
+        <w:t xml:space="preserve">Exact retrieval times, response sizes, SHA-256 checksums, release fields, and transformations are recorded in </w:t>
+      </w:r>
+      <w:r>
+        <w:rPr>
+          <w:rFonts w:ascii="Consolas" w:hAnsi="Consolas"/>
+          <w:color w:val="1F4D78"/>
+          <w:sz w:val="21"/>
+          <w:shd w:fill="EEF1F4"/>
+        </w:rPr>
+        <w:t>module/data/provenance.json</w:t>
+      </w:r>
+      <w:r>
+        <w:rPr>
+          <w:rFonts w:ascii="Calibri" w:hAnsi="Calibri"/>
+          <w:color w:val="222222"/>
+        </w:rPr>
+        <w:t xml:space="preserve"> in the repository and analysis bundle.</w:t>
       </w:r>
     </w:p>
     <w:p>
@@ -28636,7 +28821,7 @@
           <w:sz w:val="21"/>
           <w:shd w:fill="EEF1F4"/>
         </w:rPr>
-        <w:t>data/provenance.json</w:t>
+        <w:t>module/data/provenance.json</w:t>
       </w:r>
       <w:r>
         <w:rPr>
@@ -28645,7 +28830,7 @@
         </w:rPr>
         <w:t xml:space="preserve">, the lesson text, original templates, notebook narrative and code, scripts, figures, and assessments in this package are licensed under the </w:t>
       </w:r>
-      <w:hyperlink r:id="rId30">
+      <w:hyperlink r:id="rId32">
         <w:r>
           <w:rPr>
             <w:rFonts w:ascii="Calibri" w:hAnsi="Calibri"/>
@@ -28661,9 +28846,9 @@
           <w:rFonts w:ascii="Calibri" w:hAnsi="Calibri"/>
           <w:color w:val="222222"/>
         </w:rPr>
-        <w:t xml:space="preserve">. Reusers must give appropriate credit, link to the license, and indicate changes. The English repository license notice is available at </w:t>
-      </w:r>
-      <w:hyperlink r:id="rId32">
+        <w:t xml:space="preserve">. Reusers must give appropriate credit, link to the license, and indicate changes. The repository and release packages include the full English legal code; it is also available from </w:t>
+      </w:r>
+      <w:hyperlink r:id="rId36">
         <w:r>
           <w:rPr>
             <w:rFonts w:ascii="Calibri" w:hAnsi="Calibri"/>
@@ -28671,7 +28856,7 @@
             <w:u w:val="single"/>
             <w:sz w:val="22"/>
           </w:rPr>
-          <w:t>`../LICENSE`</w:t>
+          <w:t>Creative Commons</w:t>
         </w:r>
       </w:hyperlink>
       <w:r>

</xml_diff>

<commit_message>
Close final beginner publication gaps
</commit_message>
<xml_diff>
--- a/module/support/metabo_diet_instructor_packet.docx
+++ b/module/support/metabo_diet_instructor_packet.docx
@@ -2157,6 +2157,8 @@
     </w:p>
     <w:p>
       <w:pPr>
+        <w:keepNext/>
+        <w:keepLines/>
         <w:spacing w:before="0" w:after="0" w:line="240" w:lineRule="auto"/>
         <w:ind w:left="259" w:right="72"/>
         <w:shd w:fill="F3F5F7"/>
@@ -2175,6 +2177,8 @@
     </w:p>
     <w:p>
       <w:pPr>
+        <w:keepNext w:val="0"/>
+        <w:keepLines/>
         <w:spacing w:before="0" w:after="0" w:line="240" w:lineRule="auto"/>
         <w:ind w:left="259" w:right="72"/>
         <w:shd w:fill="F3F5F7"/>
@@ -2620,6 +2624,8 @@
     </w:p>
     <w:p>
       <w:pPr>
+        <w:keepNext/>
+        <w:keepLines/>
         <w:spacing w:before="0" w:after="0" w:line="240" w:lineRule="auto"/>
         <w:ind w:left="259" w:right="72"/>
         <w:shd w:fill="F3F5F7"/>
@@ -2638,6 +2644,8 @@
     </w:p>
     <w:p>
       <w:pPr>
+        <w:keepNext w:val="0"/>
+        <w:keepLines/>
         <w:spacing w:before="0" w:after="0" w:line="240" w:lineRule="auto"/>
         <w:ind w:left="259" w:right="72"/>
         <w:shd w:fill="F3F5F7"/>

</xml_diff>

<commit_message>
Polish English across release materials
</commit_message>
<xml_diff>
--- a/module/support/metabo_diet_instructor_packet.docx
+++ b/module/support/metabo_diet_instructor_packet.docx
@@ -114,7 +114,7 @@
           <w:rFonts w:ascii="Calibri" w:hAnsi="Calibri"/>
           <w:color w:val="222222"/>
         </w:rPr>
-        <w:t>Use Word's Navigation pane or the descriptive headings in the PDF to move through the packet.</w:t>
+        <w:t>In Word, use the Navigation pane. In the PDF, use this contents list or search for a descriptive heading.</w:t>
       </w:r>
     </w:p>
     <w:p>
@@ -2179,7 +2179,7 @@
       <w:pPr>
         <w:keepNext w:val="0"/>
         <w:keepLines/>
-        <w:spacing w:before="0" w:after="0" w:line="240" w:lineRule="auto"/>
+        <w:spacing w:before="0" w:after="120" w:line="240" w:lineRule="auto"/>
         <w:ind w:left="259" w:right="72"/>
         <w:shd w:fill="F3F5F7"/>
         <w:pBdr>
@@ -2646,7 +2646,7 @@
       <w:pPr>
         <w:keepNext w:val="0"/>
         <w:keepLines/>
-        <w:spacing w:before="0" w:after="0" w:line="240" w:lineRule="auto"/>
+        <w:spacing w:before="0" w:after="120" w:line="240" w:lineRule="auto"/>
         <w:ind w:left="259" w:right="72"/>
         <w:shd w:fill="F3F5F7"/>
         <w:pBdr>
@@ -3696,7 +3696,7 @@
           <w:rFonts w:ascii="Calibri" w:hAnsi="Calibri"/>
           <w:color w:val="222222"/>
         </w:rPr>
-        <w:t>The lesson Markdown includes text descriptions for conceptual access, comparison, class-summary, and PCA figures. Preserve those descriptions when converting to dashboard components.</w:t>
+        <w:t>The lesson Markdown presents conceptual access and comparison workflows as text-only sketches and includes equivalent descriptions for generated charts. Preserve those descriptions when converting the material to dashboard components.</w:t>
       </w:r>
     </w:p>
     <w:p>
@@ -5889,7 +5889,7 @@
                 <w:color w:val="222222"/>
                 <w:sz w:val="16"/>
               </w:rPr>
-              <w:t>RefMet supplies analytical-chemistry-centered standardized nomenclature.</w:t>
+              <w:t>RefMet supplies standardized nomenclature designed for analytical chemistry.</w:t>
             </w:r>
           </w:p>
         </w:tc>
@@ -26717,7 +26717,7 @@
           <w:rFonts w:ascii="Calibri" w:hAnsi="Calibri"/>
           <w:color w:val="222222"/>
         </w:rPr>
-        <w:t>St001521 Factors</w:t>
+        <w:t>ST001521 Factors</w:t>
       </w:r>
     </w:p>
     <w:p>
@@ -26809,7 +26809,7 @@
           <w:rFonts w:ascii="Calibri" w:hAnsi="Calibri"/>
           <w:color w:val="222222"/>
         </w:rPr>
-        <w:t>St003348 Factors</w:t>
+        <w:t>ST003348 Factors</w:t>
       </w:r>
     </w:p>
     <w:p>

</xml_diff>